<commit_message>
Note that Galileosky CAN tags are assigned by device configuration
Co-authored-by: isrealellera <isrealellera@inbox.lv>
</commit_message>
<xml_diff>
--- a/deliverables/ITles_Fuchs_DESIGN.docx
+++ b/deliverables/ITles_Fuchs_DESIGN.docx
@@ -5481,6 +5481,24 @@
       </w:r>
       <w:r>
         <w:t xml:space="preserve">известные значения в трекер и сверяет, что приходит на сервер.</w:t>
+      </w:r>
+      <w:r>
+        <w:t xml:space="preserve"> </w:t>
+      </w:r>
+      <w:r>
+        <w:t xml:space="preserve">По руководству пользователя Galileosky этим тегам можно назначить нужный CAN-параметр</w:t>
+      </w:r>
+      <w:r>
+        <w:t xml:space="preserve"> </w:t>
+      </w:r>
+      <w:r>
+        <w:t xml:space="preserve">в конфигураторе [проверить на приборе]. Тогда смысл тега задаётся нашей конфигурацией</w:t>
+      </w:r>
+      <w:r>
+        <w:t xml:space="preserve"> </w:t>
+      </w:r>
+      <w:r>
+        <w:t xml:space="preserve">устройства и фиксируется в профиле вместе с версией прошивки.</w:t>
       </w:r>
     </w:p>
     <w:p>

</xml_diff>